<commit_message>
Apply Ch10-11 fix list to merged v2 chapters
Ch10: comrade handshake (D12), second stance as readiness, softened
relief beat, Elara asks for quiet investigators, room/time in the
note to Anandi, "Not X. Y." removed, sitting not lying.
Ch11: Ravi's pride restored, evening timing fixed, "rose with him",
one duplicate wrist-glancing clerk cut.

Co-Authored-By: Claude Opus 5.5 <noreply@anthropic.com>
</commit_message>
<xml_diff>
--- a/claude-notes/manuscript-v2/10-then-the-key-merged.docx
+++ b/claude-notes/manuscript-v2/10-then-the-key-merged.docx
@@ -95,7 +95,7 @@
           <w:b w:val="0"/>
           <w:i w:val="0"/>
         </w:rPr>
-        <w:t>She knew the sensation from the council chamber: the Ancient One's hand rising, and the air leaving her chest as if a valve had closed. There, the system had taken her breath. Here, it had declined to give her an answer. Her body made no distinction between the two, and lying in the dark she began to suspect her body was right. Both said the same thing. Whatever she received had been issued, and could be withheld.</w:t>
+        <w:t>She knew the sensation from the council chamber: the Ancient One's hand rising, and the air leaving her chest as if a valve had closed. There, the system had taken her breath. Here, it had declined to give her an answer. Her body made no distinction between the two, and sitting in the dark she began to suspect her body was right. Both said the same thing. Whatever she received had been issued, and could be withheld.</w:t>
       </w:r>
     </w:p>
     <w:p>
@@ -243,7 +243,7 @@
           <w:b w:val="0"/>
           <w:i w:val="0"/>
         </w:rPr>
-        <w:t>Her wrist terminal sat dark on her left arm. Anything she wrote into it would be underlined somewhere she couldn't see, so she took a sheet of plain paper from the drawer and a pen that needed shaking before it would run. She hadn't written by hand since her examinations, and the slowness made every word pay for its place. She wrote two notes. The shorter one went to Anandi, and said only that she needed a room in Ashoka, lawfully, and a reason that would survive being read by anyone. The longer one she wrote three times, crossing out every sentence that sounded like a plea, until what remained sounded like an office talking to an office.</w:t>
+        <w:t>Her wrist terminal sat dark on her left arm. Anything she wrote into it would be underlined somewhere she couldn't see, so she took a sheet of plain paper from the drawer and a pen that needed shaking before it would run. She hadn't written by hand since her examinations, and the slowness made every word pay for its place. She wrote two notes. The shorter one went to Anandi, and said only that she needed a room in Ashoka, lawfully (Review Room Two, at nineteen hundred, if it could be had), and a reason that would survive being read by anyone. The longer one she wrote three times, crossing out every sentence that sounded like a plea, until what remained sounded like an office talking to an office.</w:t>
       </w:r>
     </w:p>
     <w:p>
@@ -464,7 +464,7 @@
           <w:b w:val="0"/>
           <w:i w:val="0"/>
         </w:rPr>
-        <w:t>Rohan went back to the center of the floor and sank into the stance a second time, which no schedule asked of him.</w:t>
+        <w:t>Rohan went back to the center of the floor and sank into the stance a second time, the way he did before any deployment.</w:t>
       </w:r>
     </w:p>
     <w:p>
@@ -635,7 +635,7 @@
           <w:b w:val="0"/>
           <w:i w:val="0"/>
         </w:rPr>
-        <w:t>Along one corridor wall, names had been cut into the metal: responders who had died holding evacuation routes, or containing fires, or standing between civilians and a force they could not stop. Some of the letters had been rubbed bright at shoulder height, where people passing had touched them. Ashoka did not keep its dead as founders. It kept them as duties still being carried.</w:t>
+        <w:t>Along one corridor wall, names had been cut into the metal: responders who had died holding evacuation routes, or containing fires, or standing between civilians and a force they could not stop. Some of the letters had been rubbed bright at shoulder height, where people passing had touched them. Ashoka kept its dead as duties still being carried.</w:t>
       </w:r>
     </w:p>
     <w:p>
@@ -707,7 +707,7 @@
           <w:b w:val="0"/>
           <w:i w:val="0"/>
         </w:rPr>
-        <w:t>Her shoulders came down a full inch before she could stop them.</w:t>
+        <w:t>Something in her shoulders let go. She had not been sure the plan would hold past the door.</w:t>
       </w:r>
     </w:p>
     <w:p>
@@ -824,7 +824,7 @@
           <w:b w:val="0"/>
           <w:i w:val="0"/>
         </w:rPr>
-        <w:t>"Help finding who is moving under that authority. And when we find them, help stopping them before the damage spreads past one gana, one family, one set of records." She pressed her palms down. "Without a formal alert. Without any visible change in posture. If whatever is behind this watches the system, a deployment will tell it we are looking."</w:t>
+        <w:t>"Help finding who is moving under that authority. And when we find them, help stopping them before the damage spreads past one gana, one family, one set of records." She pressed her palms down. "Without a formal alert. Without any visible change in posture. If whatever is behind this watches the system, a deployment will tell it we are looking. Your quietest investigators. People who can trace it through the other houses without being seen to."</w:t>
       </w:r>
     </w:p>
     <w:p>
@@ -905,7 +905,7 @@
           <w:b w:val="0"/>
           <w:i w:val="0"/>
         </w:rPr>
-        <w:t>He held his right hand out across the dented table. Elara stood and took it. His grip was firm and brief and had no ceremony in it at all, the glue on his knuckle rough under her fingers, and she held on exactly as long as he did.</w:t>
+        <w:t>He held his right hand out across the dented table. Elara stood and took it. His grip was firm and brief and had no ceremony in it at all, the glue on his knuckle rough under her fingers. It was the grip of someone agreeing to a plan.</w:t>
       </w:r>
     </w:p>
     <w:p>

</xml_diff>

<commit_message>
Ch10: Elara's memory follows the new Ch7 (Sarvajña's Kubera line; Draṣṭā's silent face-up cards)
Co-Authored-By: Claude Opus 5.5 <noreply@anthropic.com>
</commit_message>
<xml_diff>
--- a/claude-notes/manuscript-v2/10-then-the-key-merged.docx
+++ b/claude-notes/manuscript-v2/10-then-the-key-merged.docx
@@ -131,7 +131,7 @@
           <w:i/>
           <w:strike w:val="0"/>
         </w:rPr>
-        <w:t>Something indescribable has begun to form beneath the scales.</w:t>
+        <w:t>Something is moving inside Kubera with no name and no office on it.</w:t>
       </w:r>
     </w:p>
     <w:p>
@@ -148,11 +148,10 @@
       <w:r>
         <w:rPr>
           <w:b w:val="0"/>
-          <w:i/>
+          <w:i w:val="0"/>
           <w:strike w:val="0"/>
-          <w:color w:val="5C6B7D"/>
         </w:rPr>
-        <w:t>Prepare while preparation is still possible.</w:t>
+        <w:t>Draṣṭā had left them face up and said nothing about what any of them meant, and Elara's eyes had kept going back to the second.</w:t>
       </w:r>
     </w:p>
     <w:p>
@@ -162,7 +161,7 @@
           <w:i w:val="0"/>
           <w:strike w:val="0"/>
         </w:rPr>
-        <w:t>Prepare for what, she still didn't know. It had a shape now, two letters wide, and Drona could carry her no closer to whatever stood behind it.</w:t>
+        <w:t>What they pointed at, she still didn't know. It had a shape now, two letters wide, and Drona could carry her no closer to whatever stood behind it.</w:t>
       </w:r>
     </w:p>
     <w:p>

</xml_diff>

<commit_message>
Ch10 round 2: intake at first bell; Rohan names a price; register reworded; trims
Co-Authored-By: Claude Opus 5.5 <noreply@anthropic.com>
</commit_message>
<xml_diff>
--- a/claude-notes/manuscript-v2/10-then-the-key-merged.docx
+++ b/claude-notes/manuscript-v2/10-then-the-key-merged.docx
@@ -63,7 +63,7 @@
           <w:i w:val="0"/>
           <w:strike w:val="0"/>
         </w:rPr>
-        <w:t>There was a grey smudge on the pad of her forefinger from the archive glass. She rubbed it against her thumb and it stayed. Dust, or the old film of other officers' hands. She let it be.</w:t>
+        <w:t>There was a grey smudge on the pad of her forefinger from the archive glass. She rubbed it against her thumb and it stayed.</w:t>
       </w:r>
     </w:p>
     <w:p>
@@ -73,17 +73,7 @@
           <w:i w:val="0"/>
           <w:strike w:val="0"/>
         </w:rPr>
-        <w:t>Two letters. Every other signature in Drona's records was a door with a person behind it, an office or an elder or a line of succession she could walk back up until it reached a face. This one opened onto nothing, and the system had obeyed it anyway, without being able to say whom it was obeying.</w:t>
-      </w:r>
-    </w:p>
-    <w:p>
-      <w:r>
-        <w:rPr>
-          <w:b w:val="0"/>
-          <w:i w:val="0"/>
-          <w:strike w:val="0"/>
-        </w:rPr>
-        <w:t>She had gone into the archive looking for a lock. What she had found ran farther than she could see in either direction, a wall with nothing to climb and no end to walk around.</w:t>
+        <w:t>Two letters. Every other signature in Drona's records was a door with a person behind it, an office or an elder or a line of succession she could walk back up until it reached a face. This one opened onto nothing, and the system had obeyed it anyway.</w:t>
       </w:r>
     </w:p>
     <w:p>
@@ -103,7 +93,7 @@
           <w:i w:val="0"/>
           <w:strike w:val="0"/>
         </w:rPr>
-        <w:t>She knew the sensation from the council chamber: the Ancient One's hand rising, and the air leaving her chest as if a valve had closed. There, the system had taken her breath. Here, it had declined to give her an answer. Her body made no distinction between the two, and sitting in the dark she began to suspect her body was right. Both said the same thing. Whatever she received had been issued, and could be withheld.</w:t>
+        <w:t>She knew the sensation from the council chamber: the Ancient One's hand rising, and the air leaving her chest as if a valve had closed. Tonight the archive had declined to give her an answer. Both felt like the same hand.</w:t>
       </w:r>
     </w:p>
     <w:p>
@@ -113,7 +103,7 @@
           <w:i w:val="0"/>
           <w:strike w:val="0"/>
         </w:rPr>
-        <w:t>The ventilation grille above the door ticked as it cooled, a small dry sound like a fingernail tapped on a tooth. She counted the ticks until her lungs agreed to the count.</w:t>
+        <w:t>The ventilation grille above the door ticked as it cooled. She counted the ticks until her lungs agreed.</w:t>
       </w:r>
     </w:p>
     <w:p>
@@ -171,7 +161,7 @@
           <w:i w:val="0"/>
           <w:strike w:val="0"/>
         </w:rPr>
-        <w:t>She pulled her knees up and locked her arms around them. As a girl she had drilled herself on the difference between a weight she could act on and a weight she could only carry, the way other children drilled multiplication. Her jacket hung on the back of the door with one sleeve still inside out. She looked at it for a long time and could not sort tonight into either column.</w:t>
+        <w:t>The archive had shown her the wall and proved that something stood behind it. It could not follow two letters through another house's corridors to the hand that had written them. It could not put itself between three boys and a sealed order on the day the order became force.</w:t>
       </w:r>
     </w:p>
     <w:p>
@@ -181,7 +171,7 @@
           <w:i w:val="0"/>
           <w:strike w:val="0"/>
         </w:rPr>
-        <w:t>The archive had done what knowledge could do. It had shown her the wall and proved that something stood behind it. It could not stand at a gate. It could not put itself between three boys and a sealed order on the day the order became force. It could not make another house answer for what it did in a corridor, a chamber, or a mine.</w:t>
+        <w:t>If Drona meant to do more than know, it needed someone who could find whoever was moving behind those letters, and stand in the way.</w:t>
       </w:r>
     </w:p>
     <w:p>
@@ -191,17 +181,7 @@
           <w:i w:val="0"/>
           <w:strike w:val="0"/>
         </w:rPr>
-        <w:t>If Drona meant to do more than know, it needed a hand that could hold a line.</w:t>
-      </w:r>
-    </w:p>
-    <w:p>
-      <w:r>
-        <w:rPr>
-          <w:b w:val="0"/>
-          <w:i w:val="0"/>
-          <w:strike w:val="0"/>
-        </w:rPr>
-        <w:t>She thought of Ashoka. She set aside the force ladder and the uniforms and the procedural language Trinity used when it wanted violence to sound like housekeeping. What was left was the Ashoka its own instructors believed in: strength kept under discipline, a body placed between a person and an accusation before the accusation hardened into a sentence.</w:t>
+        <w:t>She thought of Ashoka. Set aside the force ladder and the uniforms, and what was left was the Ashoka its own instructors believed in: strength kept under discipline, a body placed between a person and an accusation before the accusation hardened into a sentence.</w:t>
       </w:r>
     </w:p>
     <w:p>
@@ -238,16 +218,6 @@
           <w:strike w:val="0"/>
         </w:rPr>
         <w:t xml:space="preserve"> He had said them and walked out under the corridor lights before she could ask what they might cost him.</w:t>
-      </w:r>
-    </w:p>
-    <w:p>
-      <w:r>
-        <w:rPr>
-          <w:b w:val="0"/>
-          <w:i w:val="0"/>
-          <w:strike w:val="0"/>
-        </w:rPr>
-        <w:t>She tried to picture the two houses side by side, and the picture that came was no treaty with two seals at its foot. It was a lantern set into a scarred open palm. Patient light resting in a disciplined grip: the hand never closing over the flame, the flame never asking the hand to soften. She distrusted the image on sight. It was too clean, the kind of thing Drona taught you to put at the end of an essay. She knew what the light was; she had lived inside it all her life. She had never been certain of the hand. She kept the image anyway.</w:t>
       </w:r>
     </w:p>
     <w:p>
@@ -367,17 +337,7 @@
           <w:i w:val="0"/>
           <w:strike w:val="0"/>
         </w:rPr>
-        <w:t>Ashoka taught its people to check the signature before the order. An order could be questioned. The person who had taken responsibility for it could not be mistaken.</w:t>
-      </w:r>
-    </w:p>
-    <w:p>
-      <w:r>
-        <w:rPr>
-          <w:b w:val="0"/>
-          <w:i w:val="0"/>
-          <w:strike w:val="0"/>
-        </w:rPr>
-        <w:t>He looked at the bottom of the page first.</w:t>
+        <w:t>Ashoka taught its people to check the signature before the order. He looked at the bottom of the page first.</w:t>
       </w:r>
     </w:p>
     <w:p>
@@ -421,7 +381,7 @@
           <w:strike w:val="0"/>
           <w:color w:val="5C6B7D"/>
         </w:rPr>
-        <w:t>I will report to Review Room Two in the Ashoka administrative wing tomorrow at 19:00. Your presence will be assumed unless you are unavailable. If you cannot attend, notify the duty station before the review period begins. No other response is required.</w:t>
+        <w:t>I will report to Review Room Two in the Ashoka administrative wing this evening at 19:00. Your presence will be assumed unless you are unavailable. If you cannot attend, notify the duty station before the review period begins. No other response is required.</w:t>
       </w:r>
     </w:p>
     <w:p>
@@ -442,7 +402,17 @@
           <w:i w:val="0"/>
           <w:strike w:val="0"/>
         </w:rPr>
-        <w:t>The decision had been made before he reached the end. No order required it, and he didn't look for one. He had given his word with three ganas watching, because he had seen a monitor hold the line for three boys who were holding it for each other, and then seen the room turn on her for it. He had said eight words and walked away before she could ask their price, because the price was his to pay. A word did not expire because keeping it had become inconvenient. Ashoka had a name for the duty that stood above the chain of command. It called it Dhamma, and he had learned the word before he could spell it.</w:t>
+        <w:t>He read it twice. Nothing in it asked him for anything he could refuse on paper. That was what worried him.</w:t>
+      </w:r>
+    </w:p>
+    <w:p>
+      <w:r>
+        <w:rPr>
+          <w:b w:val="0"/>
+          <w:i w:val="0"/>
+          <w:strike w:val="0"/>
+        </w:rPr>
+        <w:t>He had given her eight words and walked away before she could ask their price. Ashoka had a name for the duty that stood above the chain of command. It called it Dhamma, and he had learned the word before he could spell it. The word did not tell him what a Drona monitor under review wanted with Ashoka's response protocols.</w:t>
       </w:r>
     </w:p>
     <w:p>
@@ -462,7 +432,7 @@
           <w:i w:val="0"/>
           <w:strike w:val="0"/>
         </w:rPr>
-        <w:t>He folded the sheet along its crease and set it beside the crane. He would not confirm. His silence was the answer she had asked for.</w:t>
+        <w:t>He folded the sheet along its crease and set it beside the crane. He did not notify the duty station.</w:t>
       </w:r>
     </w:p>
     <w:p>
@@ -492,7 +462,7 @@
           <w:i w:val="0"/>
           <w:strike w:val="0"/>
         </w:rPr>
-        <w:t>AUTHORITY: OFFICE OF THE GRANDMASTER, DRONA.</w:t>
+        <w:t>AUTHORITY: DRONA, GRANDMASTER'S SEAL.</w:t>
       </w:r>
     </w:p>
     <w:p>
@@ -502,7 +472,7 @@
           <w:i w:val="0"/>
           <w:strike w:val="0"/>
         </w:rPr>
-        <w:t>He stayed on the last line until the reader dimmed. A handwritten letter that touched no system, and beneath it the stamped authority of Drona's own Grandmaster. Elara had not only chosen her door with care. Someone far above her had quietly agreed to hold it open.</w:t>
+        <w:t>He stayed on the last line until the reader dimmed. The letter had touched no system. The room had, and the room carried the seal of Drona's own Grandmaster. Whatever Elara meant to ask, someone far above her had agreed to hold the door open while she asked it.</w:t>
       </w:r>
     </w:p>
     <w:p>
@@ -522,7 +492,7 @@
           <w:i w:val="0"/>
           <w:strike w:val="0"/>
         </w:rPr>
-        <w:t>Elara fastened the gray-blue collar in the narrow mirror and aligned the small Drona mark at her throat.</w:t>
+        <w:t>First bell found Elara at VARIANCE with her hands flat on the console.</w:t>
       </w:r>
     </w:p>
     <w:p>
@@ -532,7 +502,7 @@
           <w:i w:val="0"/>
           <w:strike w:val="0"/>
         </w:rPr>
-        <w:t>Beside Kubera's muted gold and Ashoka's red-black, the uniform was plain. Every seam had been cut for movement between observation rooms and archive stacks. Kubera dressed to be envied and Ashoka to be obeyed. Drona dressed for the work, plain enough to disappear beside whatever it studied. She checked the closure at each wrist and pulled her hair back from her face.</w:t>
+        <w:t>The suspended grid had been turned over to intake. Miner Town's pulse-lines were dimmed to a wash, and across the front of them hung the top of the lift: a column of pale ticks, one for each body brought up out of Sector One overnight, each with a file behind it. At the head of the column a single bright mark stood for the clerk.</w:t>
       </w:r>
     </w:p>
     <w:p>
@@ -542,7 +512,7 @@
           <w:i w:val="0"/>
           <w:strike w:val="0"/>
         </w:rPr>
-        <w:t>Anandi's answer had come before dawn, three lines in her small upright hand. She had gone to the Ancient One in the night, drawing on years of goodwill earned by teaching Elara, and asked for one narrow thing: a formal Ashoka review of the Initiation response protocols, with Elara permitted to present unresolved findings directly to Rohan. The request had been endorsed and released under the Ancient One's own authority. No ordinary mentor could have opened that door.</w:t>
+        <w:t>EVENT and CORRECTION were dark. Across the grid, THRESHOLD's chair had been pushed in square to its console. The screen was blank, and the shelf beside it was empty where the manual used to sit. Nobody from Kubera had come to fill it.</w:t>
       </w:r>
     </w:p>
     <w:p>
@@ -552,7 +522,7 @@
           <w:i w:val="0"/>
           <w:strike w:val="0"/>
         </w:rPr>
-        <w:t>The approval gave her access. It gave her no answers. She touched the edge of her collar once and left before she could find a reason to wait.</w:t>
+        <w:t>In the lower corner of her screen sat the pool.</w:t>
       </w:r>
     </w:p>
     <w:p>
@@ -562,7 +532,218 @@
           <w:i w:val="0"/>
           <w:strike w:val="0"/>
         </w:rPr>
-        <w:t>The transit station lay beneath the research wing, three security gates down. At the platform she pressed her left wrist to the reader. The maglev asked no fare, but it asked identity, and it found the review code filed under the Ancient One's name and lit her route before she could state it. A representative on duty traveled a path the system already knew.</w:t>
+        <w:t>OPEN SLOTS: 0.</w:t>
+      </w:r>
+    </w:p>
+    <w:p>
+      <w:r>
+        <w:rPr>
+          <w:b w:val="0"/>
+          <w:i w:val="0"/>
+          <w:strike w:val="0"/>
+        </w:rPr>
+        <w:t>When a number came free it showed for the length of a blink before a tick at the head of the line took it and walked off toward the barracks, and the column stepped up. Below the pool ran the held list, where dead men's numbers waited on inspections nobody read. She had found 4055 there before the bell. INSPECTION OPEN. The flag was two years old.</w:t>
+      </w:r>
+    </w:p>
+    <w:p>
+      <w:r>
+        <w:rPr>
+          <w:b w:val="0"/>
+          <w:i w:val="0"/>
+          <w:strike w:val="0"/>
+        </w:rPr>
+        <w:t>Gage's file came up from the bottom of the column in no hurry at all. Ninth. Sixth. She kept her hands where they were and her terminal dark on her wrist.</w:t>
+      </w:r>
+    </w:p>
+    <w:p>
+      <w:r>
+        <w:rPr>
+          <w:b w:val="0"/>
+          <w:i w:val="0"/>
+          <w:strike w:val="0"/>
+        </w:rPr>
+        <w:t>At third, the pool went to one.</w:t>
+      </w:r>
+    </w:p>
+    <w:p>
+      <w:r>
+        <w:rPr>
+          <w:b w:val="0"/>
+          <w:i w:val="0"/>
+          <w:strike w:val="0"/>
+        </w:rPr>
+        <w:t>Her stomach dropped. A number she didn't know, from a seam the grid shaded red, and for the length of the blink it belonged to whoever reached the clerk next. The man at the head of the line reached him. The number left the pool. Zero again. The column stepped up.</w:t>
+      </w:r>
+    </w:p>
+    <w:p>
+      <w:r>
+        <w:rPr>
+          <w:b w:val="0"/>
+          <w:i w:val="0"/>
+          <w:strike w:val="0"/>
+        </w:rPr>
+        <w:t>Second.</w:t>
+      </w:r>
+    </w:p>
+    <w:p>
+      <w:r>
+        <w:rPr>
+          <w:b w:val="0"/>
+          <w:i w:val="0"/>
+          <w:strike w:val="0"/>
+        </w:rPr>
+        <w:t>She watched the clerk's mark stamp a woman's file and send her off, and then the top of the column read GAGE. DEPENDENT OF RECORD. NEXT.</w:t>
+      </w:r>
+    </w:p>
+    <w:p>
+      <w:r>
+        <w:rPr>
+          <w:b w:val="0"/>
+          <w:i w:val="0"/>
+          <w:strike w:val="0"/>
+        </w:rPr>
+        <w:t>Elara pushed the chair back and stood up.</w:t>
+      </w:r>
+    </w:p>
+    <w:p>
+      <w:r>
+        <w:rPr>
+          <w:b w:val="0"/>
+          <w:i w:val="0"/>
+          <w:strike w:val="0"/>
+        </w:rPr>
+        <w:t>That was all of it. She didn't look at the door, or the High Command button, or anywhere a person might be. She stood at VARIANCE with her arms at her sides and watched the held list.</w:t>
+      </w:r>
+    </w:p>
+    <w:p>
+      <w:r>
+        <w:rPr>
+          <w:b w:val="0"/>
+          <w:i w:val="0"/>
+          <w:strike w:val="0"/>
+        </w:rPr>
+        <w:t>The flag on 4055 changed. INSPECTION CLOSED.</w:t>
+      </w:r>
+    </w:p>
+    <w:p>
+      <w:r>
+        <w:rPr>
+          <w:b w:val="0"/>
+          <w:i w:val="0"/>
+          <w:strike w:val="0"/>
+        </w:rPr>
+        <w:t>The pool read 1. There was nothing else in it. The clerk's mark touched the top of the column, the number left the pool, and the record wrote itself across the bottom of her screen.</w:t>
+      </w:r>
+    </w:p>
+    <w:p>
+      <w:r>
+        <w:rPr>
+          <w:b w:val="0"/>
+          <w:i w:val="0"/>
+          <w:strike w:val="0"/>
+        </w:rPr>
+        <w:t>WORKER SLOT 4055. ASSIGNED: GAGE. PRIOR HOLDER: THORTON.</w:t>
+      </w:r>
+    </w:p>
+    <w:p>
+      <w:r>
+        <w:rPr>
+          <w:b w:val="0"/>
+          <w:i w:val="0"/>
+          <w:strike w:val="0"/>
+        </w:rPr>
+        <w:t>In the corner of the grid a feed from the lift head waited, grey and coarse, one touch away. She didn't open it.</w:t>
+      </w:r>
+    </w:p>
+    <w:p>
+      <w:r>
+        <w:rPr>
+          <w:b w:val="0"/>
+          <w:i w:val="0"/>
+          <w:strike w:val="0"/>
+        </w:rPr>
+        <w:t>Her terminal ticked once against her wrist. She turned it over.</w:t>
+      </w:r>
+    </w:p>
+    <w:p>
+      <w:r>
+        <w:rPr>
+          <w:b w:val="0"/>
+          <w:i/>
+          <w:strike w:val="0"/>
+          <w:color w:val="5C6B7D"/>
+        </w:rPr>
+        <w:t>Monitor left station during live intake. Appended to open review.</w:t>
+      </w:r>
+    </w:p>
+    <w:p>
+      <w:r>
+        <w:rPr>
+          <w:b w:val="0"/>
+          <w:i w:val="0"/>
+          <w:strike w:val="0"/>
+        </w:rPr>
+        <w:t>Beneath it, where it had sat since her first night on this floor, the conduct note was still pending. The new line had gone into the same file.</w:t>
+      </w:r>
+    </w:p>
+    <w:p>
+      <w:r>
+        <w:rPr>
+          <w:b w:val="0"/>
+          <w:i w:val="0"/>
+          <w:strike w:val="0"/>
+        </w:rPr>
+        <w:t>She sat down. The column stepped up. The pool read zero.</w:t>
+      </w:r>
+    </w:p>
+    <w:p>
+      <w:r>
+        <w:rPr>
+          <w:b w:val="0"/>
+          <w:i w:val="0"/>
+          <w:strike w:val="0"/>
+        </w:rPr>
+        <w:t>That evening Elara fastened the gray-blue collar in the narrow mirror and aligned the small Drona mark at her throat.</w:t>
+      </w:r>
+    </w:p>
+    <w:p>
+      <w:r>
+        <w:rPr>
+          <w:b w:val="0"/>
+          <w:i w:val="0"/>
+          <w:strike w:val="0"/>
+        </w:rPr>
+        <w:t>Kubera dressed to be envied and Ashoka to be obeyed. Drona dressed for the work, plain enough to disappear beside whatever it studied. She checked the closure at each wrist. On the left, under the cuff, the terminal still held the morning's line. She let the cuff cover it and pulled her hair back from her face.</w:t>
+      </w:r>
+    </w:p>
+    <w:p>
+      <w:r>
+        <w:rPr>
+          <w:b w:val="0"/>
+          <w:i w:val="0"/>
+          <w:strike w:val="0"/>
+        </w:rPr>
+        <w:t>Anandi's answer had come before dawn, three lines in her small upright hand. She had gone to the Ancient One in the night and asked for one narrow thing: a formal Ashoka review of the Initiation response protocols, with Elara permitted to present unresolved findings directly to Rohan. It had been released under the Ancient One's own authority.</w:t>
+      </w:r>
+    </w:p>
+    <w:p>
+      <w:r>
+        <w:rPr>
+          <w:b w:val="0"/>
+          <w:i w:val="0"/>
+          <w:strike w:val="0"/>
+        </w:rPr>
+        <w:t>She touched the edge of her collar once and left before she could find a reason to wait.</w:t>
+      </w:r>
+    </w:p>
+    <w:p>
+      <w:r>
+        <w:rPr>
+          <w:b w:val="0"/>
+          <w:i w:val="0"/>
+          <w:strike w:val="0"/>
+        </w:rPr>
+        <w:t>At the platform beneath the research wing she pressed her left wrist to the reader. The maglev asked no fare, but it asked identity, and it found the review code filed under the Ancient One's name and lit her route before she could state it.</w:t>
       </w:r>
     </w:p>
     <w:p>
@@ -582,7 +763,7 @@
           <w:i w:val="0"/>
           <w:strike w:val="0"/>
         </w:rPr>
-        <w:t>She read the passengers by habit, the way the monitoring room had taught her to read everything. A Kubera allocation officer sat with a ledger pane on one knee, his muted-gold insignia centered to the millimeter, moving figures across the glass with small proprietary flicks, like a man counting coins that would never be his. By the central rail stood an Ashoka responder, broad enough to make the carriage seem narrower, balanced against its motion without touching the rail at all. He carried no weapon. He was one.</w:t>
+        <w:t>She read the passengers by habit, the way the monitoring room had taught her to read everything. A Kubera allocation officer sat with a ledger pane on one knee, his muted-gold insignia centered to the millimeter, moving figures across the glass with small proprietary flicks. By the central rail stood an Ashoka responder, broad enough to make the carriage seem narrower, balanced against its motion without touching the rail at all. He carried no weapon. He was one.</w:t>
       </w:r>
     </w:p>
     <w:p>
@@ -622,7 +803,7 @@
           <w:i w:val="0"/>
           <w:strike w:val="0"/>
         </w:rPr>
-        <w:t>Drona fell away behind them in layers of pale stone: observation rings turning slowly on the institute spires, laundry lines strung across maintenance balconies in defiance of three separate ordinances. Children there grew up believing every question had a correct citation. She had been one of them.</w:t>
+        <w:t>Drona fell away behind them in layers of pale stone: observation rings turning slowly on the institute spires, laundry lines strung across maintenance balconies in defiance of three separate ordinances.</w:t>
       </w:r>
     </w:p>
     <w:p>
@@ -632,7 +813,7 @@
           <w:i w:val="0"/>
           <w:strike w:val="0"/>
         </w:rPr>
-        <w:t>Between towers, Trinity opened beneath the carriage, and far below it the lower levels vanished into cloud. Trinity made distance look beautiful. It was one of its oldest ways of hiding things.</w:t>
+        <w:t>Between towers, Trinity opened beneath the carriage, and far below it the lower levels vanished into cloud.</w:t>
       </w:r>
     </w:p>
     <w:p>
@@ -642,7 +823,7 @@
           <w:i w:val="0"/>
           <w:strike w:val="0"/>
         </w:rPr>
-        <w:t>Trinity-3 changed before the signs did. Drona's buildings invited the eye to rest. Ashoka's rose in hard planes, with reinforced bridges, sealed entrances, and landing decks broad enough for armored transports. Red markers slid past the windows, each one naming an emergency route or a protected access.</w:t>
+        <w:t>Trinity-3 changed before the signs did. Drona's buildings invited the eye to rest. Ashoka's rose in hard planes, with reinforced bridges and landing decks broad enough for armored transports.</w:t>
       </w:r>
     </w:p>
     <w:p>
@@ -662,7 +843,7 @@
           <w:i w:val="0"/>
           <w:strike w:val="0"/>
         </w:rPr>
-        <w:t>The station allowed one direction of travel. Its far end narrowed to a single gate of red-marked steel, and when Elara laid her hand to the scanner it read her insignia, the Ancient One's authority, and her destination.</w:t>
+        <w:t>The station narrowed to a single gate of red-marked steel, and when Elara laid her hand to the scanner it read her insignia, the Ancient One's authority, and her destination.</w:t>
       </w:r>
     </w:p>
     <w:p>
@@ -682,7 +863,7 @@
           <w:i w:val="0"/>
           <w:strike w:val="0"/>
         </w:rPr>
-        <w:t>The gate opened one body wide and sealed behind her. A thin red line lit along the floor's edge, tracing her route and no other.</w:t>
+        <w:t>The gate opened one body wide and sealed behind her. A thin red line lit along the floor's edge, tracing her route.</w:t>
       </w:r>
     </w:p>
     <w:p>
@@ -692,7 +873,7 @@
           <w:i w:val="0"/>
           <w:strike w:val="0"/>
         </w:rPr>
-        <w:t>Ashoka Headquarters rose around a central training court. Recruits drilled under silent instructors. A file of responders crossed an upper bridge. At the far end of the court, a red insignia had been set into the floor so deep it looked less like decoration than a wound the building had chosen to keep visible.</w:t>
+        <w:t>Ashoka Headquarters rose around a central training court where recruits drilled under silent instructors. At the far end of the court, a red insignia had been set into the floor so deep it looked less like decoration than a wound the building had chosen to keep visible.</w:t>
       </w:r>
     </w:p>
     <w:p>
@@ -702,7 +883,7 @@
           <w:i w:val="0"/>
           <w:strike w:val="0"/>
         </w:rPr>
-        <w:t>Along one corridor wall, names had been cut into the metal: responders who had died holding evacuation routes, or containing fires, or standing between civilians and a force they could not stop. Some of the letters had been rubbed bright at shoulder height, where people passing had touched them. Ashoka kept its dead as duties still being carried.</w:t>
+        <w:t>Along one corridor wall, names had been cut into the metal: responders who had died holding evacuation routes, or containing fires, or standing between civilians and a force they could not stop. Some of the letters had been rubbed bright at shoulder height, where people passing had touched them.</w:t>
       </w:r>
     </w:p>
     <w:p>
@@ -762,7 +943,7 @@
           <w:i w:val="0"/>
           <w:strike w:val="0"/>
         </w:rPr>
-        <w:t>Elara kept walking, and the request she was carrying grew heavier with every name on the wall. Drona answered a request with analysis. The worst it risked was being wrong. Ashoka answered with bodies, and she was about to ask it to stake them on a judgment she could not prove.</w:t>
+        <w:t>The request she was carrying grew heavier with every name on the wall. Drona answered a request with analysis. Ashoka answered with bodies, and she was about to ask it to stake them on a judgment she could not prove, with a line on her review from this morning that she could not explain.</w:t>
       </w:r>
     </w:p>
     <w:p>
@@ -782,7 +963,7 @@
           <w:i w:val="0"/>
           <w:strike w:val="0"/>
         </w:rPr>
-        <w:t>Something in her shoulders let go. She had not been sure the plan would hold past the door.</w:t>
+        <w:t>Rohan was already seated at the far side of the table, shoulders still, hands resting where he could reach anything without appearing ready to. His face gave away nothing. The table between them had a shallow dent near his end where someone had once brought a fist down, and Ashoka had evidently decided the dent should stay too.</w:t>
       </w:r>
     </w:p>
     <w:p>
@@ -792,17 +973,7 @@
           <w:i w:val="0"/>
           <w:strike w:val="0"/>
         </w:rPr>
-        <w:t>Rohan was already seated at the far side of the table, shoulders still, hands resting where he could reach anything without appearing ready to. His face gave away nothing. What filled the room was his directness: he looked at her the way he would look at a sparring partner across a mat, waiting for the true move, and pretense became foolish before she had said a word. The table between them had a shallow dent near his end where someone had once brought a fist down, and Ashoka had evidently decided the dent should stay too.</w:t>
-      </w:r>
-    </w:p>
-    <w:p>
-      <w:r>
-        <w:rPr>
-          <w:b w:val="0"/>
-          <w:i w:val="0"/>
-          <w:strike w:val="0"/>
-        </w:rPr>
-        <w:t>She sat. She did not tell him what he had watched from the CORRECTION console three stations from her own. She laid the events in sequence instead, the way Drona built a case, until the separate incidents stopped looking separate and began to look like a direction.</w:t>
+        <w:t>She sat. She did not tell him what he had watched from the CORRECTION console three consoles from her own. She laid the events in sequence instead, the way Drona built a case, until the separate incidents stopped looking separate and began to look like a direction.</w:t>
       </w:r>
     </w:p>
     <w:p>
@@ -822,7 +993,7 @@
           <w:i w:val="0"/>
           <w:strike w:val="0"/>
         </w:rPr>
-        <w:t>"Before the boys walked out of the mine gates, I altered the record," she said. "I kept them together. No one authorized it. I decided that what they chose in that chamber was evidence, and I preserved it." Her voice held. Her hands, flat on the table, did not. "You should know that before you agree to anything. The person asking for Ashoka's help has already broken procedure once."</w:t>
+        <w:t>"Before the boys walked out of the mine gates, I altered the record," she said. "I kept them together. No one authorized it. I decided that what they chose in that chamber was evidence, and I preserved it." Her voice held. Her hands, flat on the table, did not. "And this morning at first bell I left my station during a live intake. The terminal logged it. It's appended to my open review, and I won't tell you why, in this room or any other. You should know that before you agree to anything. The person asking for Ashoka's help has already broken procedure twice."</w:t>
       </w:r>
     </w:p>
     <w:p>
@@ -832,7 +1003,7 @@
           <w:i w:val="0"/>
           <w:strike w:val="0"/>
         </w:rPr>
-        <w:t>Rohan's expression didn't move. "I stood three consoles away. I watched Daren accuse you, and I made you a promise anyway. Ashoka does not retract its word because the truth arrives with details."</w:t>
+        <w:t>Rohan's eyes went to her left cuff and came back. His expression didn't move. "I stood three consoles away. I watched Daren accuse you, and I made you a promise anyway. Ashoka does not retract its word because the truth arrives with details."</w:t>
       </w:r>
     </w:p>
     <w:p>
@@ -842,7 +1013,7 @@
           <w:i w:val="0"/>
           <w:strike w:val="0"/>
         </w:rPr>
-        <w:t>The breath she let out had been in her a long time.</w:t>
+        <w:t>She gave him the rest: the council, the cards, the library wing, the doubled transfer, the native record, and at the bottom of it two letters that no registry contained. He listened without interrupting.</w:t>
       </w:r>
     </w:p>
     <w:p>
@@ -852,7 +1023,7 @@
           <w:i w:val="0"/>
           <w:strike w:val="0"/>
         </w:rPr>
-        <w:t>She gave him the rest: the council, the cards, the library wing, the doubled transfer, the native record, and at the bottom of it two letters that no registry contained. He listened without interrupting, every reaction put away somewhere behind his face.</w:t>
+        <w:t>"So," he said, and leaned forward by the smallest possible degree. "What do you want from Ashoka that you could not put in the letter?"</w:t>
       </w:r>
     </w:p>
     <w:p>
@@ -862,17 +1033,7 @@
           <w:i w:val="0"/>
           <w:strike w:val="0"/>
         </w:rPr>
-        <w:t>"So," he said, and leaned forward by the smallest possible degree. "How can I help you with all this?"</w:t>
-      </w:r>
-    </w:p>
-    <w:p>
-      <w:r>
-        <w:rPr>
-          <w:b w:val="0"/>
-          <w:i w:val="0"/>
-          <w:strike w:val="0"/>
-        </w:rPr>
-        <w:t>"We are stuck," Elara said. "Not only Drona. Whatever this is, it is moving through the balance that keeps Trinity standing. If someone means to destabilize that balance, each gana will be pulled into its own crisis and fall back on its own instinct. Ashoka will spend its strength on containment. Drona will turn inward to guard what it knows."</w:t>
+        <w:t>"We are stuck," Elara said. "Not only Drona. Whatever this is, it is moving through the balance that keeps Trinity standing. Push on it, and each gana falls back on its own instinct. Ashoka will spend its strength on containment. Drona will turn inward to guard what it knows."</w:t>
       </w:r>
     </w:p>
     <w:p>
@@ -892,7 +1053,7 @@
           <w:i w:val="0"/>
           <w:strike w:val="0"/>
         </w:rPr>
-        <w:t>"Yes. That is the trap." She kept her eyes on his. "Kubera will close around its reserves. Chanakya will defend its interpretations instead of testing them. Four houses, each doing exactly what it was built for, and the city left unwatched in the middle. Chaos has always favored the people who know how to profit from it."</w:t>
+        <w:t>"Yes. That is the trap." She kept her eyes on his. "Kubera will close around its reserves. Chanakya will defend its interpretations instead of testing them. Four houses, each doing exactly what it was built for, and the city left unwatched in the middle. Whoever signed those two letters is counting on it."</w:t>
       </w:r>
     </w:p>
     <w:p>
@@ -902,7 +1063,7 @@
           <w:i w:val="0"/>
           <w:strike w:val="0"/>
         </w:rPr>
-        <w:t>"And what do you need from mine?"</w:t>
+        <w:t>"Then say what you need."</w:t>
       </w:r>
     </w:p>
     <w:p>
@@ -922,7 +1083,7 @@
           <w:i w:val="0"/>
           <w:strike w:val="0"/>
         </w:rPr>
-        <w:t>Rohan looked toward the narrow windows, where the red lights of the outer platforms blinked against the dark. He was silent for a full minute. To Elara it became a whole night. Sweat gathered at her hairline, and every warning she had offered began to turn around in her mind and point back at her.</w:t>
+        <w:t>"You came through my gate under your Grandmaster's seal," Rohan said. "That register is not private."</w:t>
       </w:r>
     </w:p>
     <w:p>
@@ -932,7 +1093,7 @@
           <w:i w:val="0"/>
           <w:strike w:val="0"/>
         </w:rPr>
-        <w:t>"Ashoka does not act on hunches," he said. "We act on intelligence, and we do not believe in half measures. If we deploy our investigative wing and confirm a threat, we will move fast, and the consequences for the target may be severe. Collateral harm is never our objective. I will not pretend it is not a risk." He didn't look away. "Are you certain this is real? Serious enough for Ashoka?"</w:t>
+        <w:t>"Let them see a monitor under review at a procedural consultation. That's all there is to see."</w:t>
       </w:r>
     </w:p>
     <w:p>
@@ -942,7 +1103,7 @@
           <w:i w:val="0"/>
           <w:strike w:val="0"/>
         </w:rPr>
-        <w:t>She looked inward and found Anandi's patience, Kavik's precision, Sarvajña's warning, Draṣṭā's cards, and the Ancient One's unbearable stillness. None of them had given her certainty. They had given her the discipline to act without it.</w:t>
+        <w:t>Rohan looked toward the narrow windows, where the red lights of the outer platforms blinked against the dark. He was silent for a full minute. Sweat gathered at her hairline, and every warning she had offered began to turn around in her mind and point back at her.</w:t>
       </w:r>
     </w:p>
     <w:p>
@@ -952,7 +1113,27 @@
           <w:i w:val="0"/>
           <w:strike w:val="0"/>
         </w:rPr>
-        <w:t>"No," she said. "I am not certain. If I waited for certainty, it would arrive in the form of the damage itself. What I am certain of is what I have seen, what the records show, and what it will cost if we are slow. I will put my name to every word I have said in this room."</w:t>
+        <w:t>"Ashoka does not act on hunches," he said. "If we deploy our investigative wing and confirm a threat, we will move fast, and the consequences for the target may be severe. I will not pretend that is not a risk." He didn't look away. "Are you certain this is real? Serious enough for Ashoka?"</w:t>
+      </w:r>
+    </w:p>
+    <w:p>
+      <w:r>
+        <w:rPr>
+          <w:b w:val="0"/>
+          <w:i w:val="0"/>
+          <w:strike w:val="0"/>
+        </w:rPr>
+        <w:t>Anandi, Kavik, Sarvajña, Draṣṭā, the Ancient One: none of them had given her certainty. They had given her the discipline to act without it.</w:t>
+      </w:r>
+    </w:p>
+    <w:p>
+      <w:r>
+        <w:rPr>
+          <w:b w:val="0"/>
+          <w:i w:val="0"/>
+          <w:strike w:val="0"/>
+        </w:rPr>
+        <w:t>"No," she said. "I am not certain. If I waited for certainty, it would arrive in the form of the damage itself. What I am certain of is what I have seen, what the records show, and what it will cost if we are slow."</w:t>
       </w:r>
     </w:p>
     <w:p>
@@ -972,7 +1153,63 @@
           <w:i w:val="0"/>
           <w:strike w:val="0"/>
         </w:rPr>
-        <w:t>"Ashoka stands between the city and whatever is coming," he said. "All of it. The three Trinitys and every sector beneath them. Our platform is where we live. It is not where our duty ends. We will find where the pressure begins, and we will not let an unnamed power turn that duty against the people we exist to protect."</w:t>
+        <w:t>"Then hear the price," he said. "If my people find this, Ashoka hears it before you do. And your name goes on the request."</w:t>
+      </w:r>
+    </w:p>
+    <w:p>
+      <w:r>
+        <w:rPr>
+          <w:b w:val="0"/>
+          <w:i w:val="0"/>
+          <w:strike w:val="0"/>
+        </w:rPr>
+        <w:t xml:space="preserve">Whatever they found would reach Ashoka first, and her when Ashoka chose. And her name would sit on a request to another gana's Grandmaster, where anyone who came looking for the struck line in the induction file, or the line from this morning, would find it waiting. </w:t>
+      </w:r>
+      <w:r>
+        <w:rPr>
+          <w:b w:val="0"/>
+          <w:i/>
+          <w:strike w:val="0"/>
+        </w:rPr>
+        <w:t>You signed,</w:t>
+      </w:r>
+      <w:r>
+        <w:rPr>
+          <w:b w:val="0"/>
+          <w:i w:val="0"/>
+          <w:strike w:val="0"/>
+        </w:rPr>
+        <w:t xml:space="preserve"> the Ancient One had said.</w:t>
+      </w:r>
+    </w:p>
+    <w:p>
+      <w:r>
+        <w:rPr>
+          <w:b w:val="0"/>
+          <w:i w:val="0"/>
+          <w:strike w:val="0"/>
+        </w:rPr>
+        <w:t>"Put it there," Elara said. "Elara Nathan, Drona."</w:t>
+      </w:r>
+    </w:p>
+    <w:p>
+      <w:r>
+        <w:rPr>
+          <w:b w:val="0"/>
+          <w:i w:val="0"/>
+          <w:strike w:val="0"/>
+        </w:rPr>
+        <w:t>He held her eyes until he was sure she meant it.</w:t>
+      </w:r>
+    </w:p>
+    <w:p>
+      <w:r>
+        <w:rPr>
+          <w:b w:val="0"/>
+          <w:i w:val="0"/>
+          <w:strike w:val="0"/>
+        </w:rPr>
+        <w:t>"Then it is Ashoka's problem," he said. "It was already. You just told me where to look."</w:t>
       </w:r>
     </w:p>
     <w:p>

</xml_diff>

<commit_message>
Ch10 round 3: Rohan demands the reason; Elara tells 4055, shields the others; single ending
Co-Authored-By: Claude Opus 5.5 <noreply@anthropic.com>
</commit_message>
<xml_diff>
--- a/claude-notes/manuscript-v2/10-then-the-key-merged.docx
+++ b/claude-notes/manuscript-v2/10-then-the-key-merged.docx
@@ -23,7 +23,7 @@
           <w:strike w:val="0"/>
           <w:color w:val="5C6B7D"/>
         </w:rPr>
-        <w:t>Ben looked between them — the Engine about to charge blindly into the dark, the Fighter about to collapse into himself — and said the only thing that mattered: “We stay together. We think. Then we move.”</w:t>
+        <w:t>“We stay together. We think. Then we move.”</w:t>
       </w:r>
     </w:p>
     <w:p>
@@ -247,7 +247,7 @@
           <w:i w:val="0"/>
           <w:strike w:val="0"/>
         </w:rPr>
-        <w:t>She folded it once. By the time the grille stopped ticking, it was on its way to a door in the Ashoka barracks.</w:t>
+        <w:t>She folded the longer note once. By the time the grille stopped ticking, it was on its way to a door in the Ashoka barracks.</w:t>
       </w:r>
     </w:p>
     <w:p>
@@ -287,7 +287,7 @@
           <w:i w:val="0"/>
           <w:strike w:val="0"/>
         </w:rPr>
-        <w:t>He held the horse stance low, thighs level, until they trembled and then past the trembling. Controlled descents that denied the body its momentum. Breath measured against the strain until the mind stopped asking when it would end. Sweat ran down the scar along his jaw. The split across his third knuckle had opened again in pad work, because the little ones hit with their whole bodies and his hands took whatever the pads missed; he had sealed it with a thread of medical glue that pulled when he made a fist. Failure might happen. Surrender was never permitted to arrive first.</w:t>
+        <w:t>He held the horse stance low, thighs level, until they trembled and then past the trembling. Controlled descents that denied the body its momentum. Breath measured against the strain until the mind stopped asking when it would end. Sweat ran down the scar along his jaw. The split across his third knuckle had opened again in pad work, because the little ones hit with their whole bodies and his hands took whatever the pads missed; he had sealed it with a thread of medical glue that pulled when he made a fist.</w:t>
       </w:r>
     </w:p>
     <w:p>
@@ -482,7 +482,7 @@
           <w:i w:val="0"/>
           <w:strike w:val="0"/>
         </w:rPr>
-        <w:t>Rohan went back to the center of the floor and sank into the stance a second time, the way he did before any deployment.</w:t>
+        <w:t>Rohan went back to the center of the floor and sank into the stance a second time. He did the same before any deployment.</w:t>
       </w:r>
     </w:p>
     <w:p>
@@ -602,7 +602,7 @@
           <w:i w:val="0"/>
           <w:strike w:val="0"/>
         </w:rPr>
-        <w:t>Elara pushed the chair back and stood up.</w:t>
+        <w:t>Elara pushed the chair back and stood up. Someone would see it. That was the arrangement.</w:t>
       </w:r>
     </w:p>
     <w:p>
@@ -673,7 +673,25 @@
           <w:strike w:val="0"/>
           <w:color w:val="5C6B7D"/>
         </w:rPr>
-        <w:t>Monitor left station during live intake. Appended to open review.</w:t>
+        <w:t>Monitor left station during live intake.</w:t>
+      </w:r>
+      <w:r>
+        <w:rPr>
+          <w:b w:val="0"/>
+          <w:i w:val="0"/>
+          <w:strike w:val="0"/>
+          <w:color w:val="5C6B7D"/>
+        </w:rPr>
+        <w:t xml:space="preserve"> The station had read her standing as gone. </w:t>
+      </w:r>
+      <w:r>
+        <w:rPr>
+          <w:b w:val="0"/>
+          <w:i/>
+          <w:strike w:val="0"/>
+          <w:color w:val="5C6B7D"/>
+        </w:rPr>
+        <w:t>Appended to open review.</w:t>
       </w:r>
     </w:p>
     <w:p>
@@ -763,7 +781,7 @@
           <w:i w:val="0"/>
           <w:strike w:val="0"/>
         </w:rPr>
-        <w:t>She read the passengers by habit, the way the monitoring room had taught her to read everything. A Kubera allocation officer sat with a ledger pane on one knee, his muted-gold insignia centered to the millimeter, moving figures across the glass with small proprietary flicks. By the central rail stood an Ashoka responder, broad enough to make the carriage seem narrower, balanced against its motion without touching the rail at all. He carried no weapon. He was one.</w:t>
+        <w:t>She read the passengers by habit; the monitoring room had taught her to read everything. A Kubera allocation officer sat with a ledger pane on one knee, his muted-gold insignia centered to the millimeter, moving figures across the glass with small proprietary flicks. By the central rail stood an Ashoka responder, broad enough to make the carriage seem narrower, balanced against its motion without touching the rail at all. He carried no weapon. He was one.</w:t>
       </w:r>
     </w:p>
     <w:p>
@@ -783,7 +801,7 @@
           <w:i w:val="0"/>
           <w:strike w:val="0"/>
         </w:rPr>
-        <w:t>The infant didn't look away the way the adults did. It stared at Elara's collar, freed one fist from the sling, and pointed straight at the Drona mark. Then it turned to its mother and delivered a solemn burst of explanation, every syllable urgent and none of them words. The mother followed the finger, met Elara's eyes, and smiled an apology.</w:t>
+        <w:t>The adults looked away. The infant didn't. It stared at Elara's collar, freed one fist from the sling, and pointed straight at the Drona mark. Then it turned to its mother and delivered a solemn burst of explanation, every syllable urgent and none of them words. The mother followed the finger, met Elara's eyes, and smiled an apology.</w:t>
       </w:r>
     </w:p>
     <w:p>
@@ -794,26 +812,6 @@
           <w:strike w:val="0"/>
         </w:rPr>
         <w:t>Elara laughed before she could stop it, a small sound into her own sleeve. The child had identified her entire authority in one gesture and then asked for a second opinion. The infant, satisfied, put the fist in its mouth.</w:t>
-      </w:r>
-    </w:p>
-    <w:p>
-      <w:r>
-        <w:rPr>
-          <w:b w:val="0"/>
-          <w:i w:val="0"/>
-          <w:strike w:val="0"/>
-        </w:rPr>
-        <w:t>Drona fell away behind them in layers of pale stone: observation rings turning slowly on the institute spires, laundry lines strung across maintenance balconies in defiance of three separate ordinances.</w:t>
-      </w:r>
-    </w:p>
-    <w:p>
-      <w:r>
-        <w:rPr>
-          <w:b w:val="0"/>
-          <w:i w:val="0"/>
-          <w:strike w:val="0"/>
-        </w:rPr>
-        <w:t>Between towers, Trinity opened beneath the carriage, and far below it the lower levels vanished into cloud.</w:t>
       </w:r>
     </w:p>
     <w:p>
@@ -943,7 +941,7 @@
           <w:i w:val="0"/>
           <w:strike w:val="0"/>
         </w:rPr>
-        <w:t>The request she was carrying grew heavier with every name on the wall. Drona answered a request with analysis. Ashoka answered with bodies, and she was about to ask it to stake them on a judgment she could not prove, with a line on her review from this morning that she could not explain.</w:t>
+        <w:t>The request she was carrying grew heavier with every name on the wall. Drona answered a request with analysis. Ashoka answered with bodies, and she was about to ask it to stake them on a judgment she could not prove, with a line on her review from this morning that she would not explain.</w:t>
       </w:r>
     </w:p>
     <w:p>
@@ -973,7 +971,7 @@
           <w:i w:val="0"/>
           <w:strike w:val="0"/>
         </w:rPr>
-        <w:t>She sat. She did not tell him what he had watched from the CORRECTION console three consoles from her own. She laid the events in sequence instead, the way Drona built a case, until the separate incidents stopped looking separate and began to look like a direction.</w:t>
+        <w:t>She sat. She did not tell him what he had watched from the CORRECTION console three consoles from her own. She laid the events in sequence instead, by Drona's method, until the separate incidents stopped looking separate and began to look like a direction.</w:t>
       </w:r>
     </w:p>
     <w:p>
@@ -993,7 +991,7 @@
           <w:i w:val="0"/>
           <w:strike w:val="0"/>
         </w:rPr>
-        <w:t>"Before the boys walked out of the mine gates, I altered the record," she said. "I kept them together. No one authorized it. I decided that what they chose in that chamber was evidence, and I preserved it." Her voice held. Her hands, flat on the table, did not. "And this morning at first bell I left my station during a live intake. The terminal logged it. It's appended to my open review, and I won't tell you why, in this room or any other. You should know that before you agree to anything. The person asking for Ashoka's help has already broken procedure twice."</w:t>
+        <w:t>"Before the boys walked out of the mine gates, I altered the record," she said. "I kept them together. No one authorized it. I decided that what they chose in that chamber was evidence, and I preserved it." Her voice held. Her hands, flat on the table, did not. "And this morning at first bell I left my station during a live intake. The terminal logged it. It's appended to my open review. I won't tell you why I stood up, in this room or any other. You should know that before you agree to anything. The person asking for Ashoka's help has already broken procedure twice."</w:t>
       </w:r>
     </w:p>
     <w:p>
@@ -1003,7 +1001,7 @@
           <w:i w:val="0"/>
           <w:strike w:val="0"/>
         </w:rPr>
-        <w:t>Rohan's eyes went to her left cuff and came back. His expression didn't move. "I stood three consoles away. I watched Daren accuse you, and I made you a promise anyway. Ashoka does not retract its word because the truth arrives with details."</w:t>
+        <w:t>Rohan's eyes went to her left cuff and came back. His expression didn't move. "I stood three consoles away. I watched Daren accuse you, and I made you a promise anyway." He let the silence sit. "A promise is not a deployment. Go on."</w:t>
       </w:r>
     </w:p>
     <w:p>
@@ -1033,7 +1031,7 @@
           <w:i w:val="0"/>
           <w:strike w:val="0"/>
         </w:rPr>
-        <w:t>"We are stuck," Elara said. "Not only Drona. Whatever this is, it is moving through the balance that keeps Trinity standing. Push on it, and each gana falls back on its own instinct. Ashoka will spend its strength on containment. Drona will turn inward to guard what it knows."</w:t>
+        <w:t>"We are stuck," Elara said. "Whatever this is, it is moving through the balance that keeps Trinity standing. Push on it, and each gana falls back on its own instinct. Ashoka will contain. Drona will hoard. Kubera will close its books. Nobody will look at the gap. Whoever signed those two letters is counting on it."</w:t>
       </w:r>
     </w:p>
     <w:p>
@@ -1053,7 +1051,7 @@
           <w:i w:val="0"/>
           <w:strike w:val="0"/>
         </w:rPr>
-        <w:t>"Yes. That is the trap." She kept her eyes on his. "Kubera will close around its reserves. Chanakya will defend its interpretations instead of testing them. Four houses, each doing exactly what it was built for, and the city left unwatched in the middle. Whoever signed those two letters is counting on it."</w:t>
+        <w:t>"Yes. That is the trap."</w:t>
       </w:r>
     </w:p>
     <w:p>
@@ -1153,7 +1151,7 @@
           <w:i w:val="0"/>
           <w:strike w:val="0"/>
         </w:rPr>
-        <w:t>"Then hear the price," he said. "If my people find this, Ashoka hears it before you do. And your name goes on the request."</w:t>
+        <w:t>"Then hear the price," he said. "Ashoka does not deploy for someone who hides her own breach. Tell me why you stood up, or take your request back to Drona."</w:t>
       </w:r>
     </w:p>
     <w:p>
@@ -1163,7 +1161,67 @@
           <w:i w:val="0"/>
           <w:strike w:val="0"/>
         </w:rPr>
-        <w:t xml:space="preserve">Whatever they found would reach Ashoka first, and her when Ashoka chose. And her name would sit on a request to another gana's Grandmaster, where anyone who came looking for the struck line in the induction file, or the line from this morning, would find it waiting. </w:t>
+        <w:t>She had carried the morning here under her cuff and meant to carry it out again. It was not only hers to give, and he was asking for all of it.</w:t>
+      </w:r>
+    </w:p>
+    <w:p>
+      <w:r>
+        <w:rPr>
+          <w:b w:val="0"/>
+          <w:i w:val="0"/>
+          <w:strike w:val="0"/>
+        </w:rPr>
+        <w:t>"There was a held number on the inspection list," she said. "4055. A dead man's slot, flagged for two years and never read. This morning the flag closed while the pool was empty and one boy stood at the head of the line, and the slot went to him. His father's number." Her palms pressed the wood and would not stop shaking. "I stood up so that it would close then. No one ordered it. I did it alone."</w:t>
+      </w:r>
+    </w:p>
+    <w:p>
+      <w:r>
+        <w:rPr>
+          <w:b w:val="0"/>
+          <w:i w:val="0"/>
+          <w:strike w:val="0"/>
+        </w:rPr>
+        <w:t>"An inspection flag does not clear because a monitor stands."</w:t>
+      </w:r>
+    </w:p>
+    <w:p>
+      <w:r>
+        <w:rPr>
+          <w:b w:val="0"/>
+          <w:i w:val="0"/>
+          <w:strike w:val="0"/>
+        </w:rPr>
+        <w:t>"No."</w:t>
+      </w:r>
+    </w:p>
+    <w:p>
+      <w:r>
+        <w:rPr>
+          <w:b w:val="0"/>
+          <w:i w:val="0"/>
+          <w:strike w:val="0"/>
+        </w:rPr>
+        <w:t>He looked at her hands and did not ask the next question.</w:t>
+      </w:r>
+    </w:p>
+    <w:p>
+      <w:r>
+        <w:rPr>
+          <w:b w:val="0"/>
+          <w:i w:val="0"/>
+          <w:strike w:val="0"/>
+        </w:rPr>
+        <w:t>"The rest of the price," he said. "If my people find this, Ashoka hears it before you do. And your name goes on the request."</w:t>
+      </w:r>
+    </w:p>
+    <w:p>
+      <w:r>
+        <w:rPr>
+          <w:b w:val="0"/>
+          <w:i w:val="0"/>
+          <w:strike w:val="0"/>
+        </w:rPr>
+        <w:t xml:space="preserve">Whatever they found would reach Ashoka first, and reach her only when Ashoka chose. And her name would sit on a request to another gana's Grandmaster, where anyone who came looking for the struck line in the induction file, or the line from this morning, would find it waiting. </w:t>
       </w:r>
       <w:r>
         <w:rPr>
@@ -1219,27 +1277,7 @@
           <w:i w:val="0"/>
           <w:strike w:val="0"/>
         </w:rPr>
-        <w:t>He rose.</w:t>
-      </w:r>
-    </w:p>
-    <w:p>
-      <w:r>
-        <w:rPr>
-          <w:b w:val="0"/>
-          <w:i w:val="0"/>
-          <w:strike w:val="0"/>
-        </w:rPr>
-        <w:t>"Very well, Monitor Nathan. I will request an audience with the Grandmaster, and bring you word as soon as I am heard."</w:t>
-      </w:r>
-    </w:p>
-    <w:p>
-      <w:r>
-        <w:rPr>
-          <w:b w:val="0"/>
-          <w:i w:val="0"/>
-          <w:strike w:val="0"/>
-        </w:rPr>
-        <w:t>He held his right hand out across the dented table. Elara stood and took it. His grip was firm and brief and had no ceremony in it at all, the glue on his knuckle rough under her fingers. It was the grip of someone agreeing to a plan.</w:t>
+        <w:t>He rose and held his right hand out across the dented table. Elara stood and took it. His grip was firm and brief and had no ceremony in it at all, the glue on his knuckle rough under her fingers.</w:t>
       </w:r>
     </w:p>
     <w:p>

</xml_diff>

<commit_message>
Ch10 final: cut 'I did it alone'; OG named; opening and tour trims
Co-Authored-By: Claude Opus 5.5 <noreply@anthropic.com>
</commit_message>
<xml_diff>
--- a/claude-notes/manuscript-v2/10-then-the-key-merged.docx
+++ b/claude-notes/manuscript-v2/10-then-the-key-merged.docx
@@ -73,7 +73,7 @@
           <w:i w:val="0"/>
           <w:strike w:val="0"/>
         </w:rPr>
-        <w:t>Two letters. Every other signature in Drona's records was a door with a person behind it, an office or an elder or a line of succession she could walk back up until it reached a face. This one opened onto nothing, and the system had obeyed it anyway.</w:t>
+        <w:t>OG. Two letters, and no registered authority behind them. Every other signature in Drona's records was a door with a person behind it, an office or an elder or a line of succession she could walk back up until it reached a face. This one opened onto nothing, and the system had obeyed it anyway.</w:t>
       </w:r>
     </w:p>
     <w:p>
@@ -93,7 +93,7 @@
           <w:i w:val="0"/>
           <w:strike w:val="0"/>
         </w:rPr>
-        <w:t>She knew the sensation from the council chamber: the Ancient One's hand rising, and the air leaving her chest as if a valve had closed. Tonight the archive had declined to give her an answer. Both felt like the same hand.</w:t>
+        <w:t>She knew the sensation from the council chamber: the Ancient One's hand rising, and the air leaving her chest as if a valve had closed. Tonight the archive had done the same thing without raising one.</w:t>
       </w:r>
     </w:p>
     <w:p>
@@ -131,7 +131,7 @@
           <w:i w:val="0"/>
           <w:strike w:val="0"/>
         </w:rPr>
-        <w:t>Then Draṣṭā's cards, turned one by one on the dark wood. Trishanku, hung between categories. Ashwatthama, a conflict that could not end. Rahu, the danger that kept returning.</w:t>
+        <w:t>It had a shape now, two letters wide, and Drona could carry her no closer to what stood behind it.</w:t>
       </w:r>
     </w:p>
     <w:p>
@@ -141,27 +141,7 @@
           <w:i w:val="0"/>
           <w:strike w:val="0"/>
         </w:rPr>
-        <w:t>Draṣṭā had left them face up and said nothing about what any of them meant, and Elara's eyes had kept going back to the second.</w:t>
-      </w:r>
-    </w:p>
-    <w:p>
-      <w:r>
-        <w:rPr>
-          <w:b w:val="0"/>
-          <w:i w:val="0"/>
-          <w:strike w:val="0"/>
-        </w:rPr>
-        <w:t>What they pointed at, she still didn't know. It had a shape now, two letters wide, and Drona could carry her no closer to whatever stood behind it.</w:t>
-      </w:r>
-    </w:p>
-    <w:p>
-      <w:r>
-        <w:rPr>
-          <w:b w:val="0"/>
-          <w:i w:val="0"/>
-          <w:strike w:val="0"/>
-        </w:rPr>
-        <w:t>The archive had shown her the wall and proved that something stood behind it. It could not follow two letters through another house's corridors to the hand that had written them. It could not put itself between three boys and a sealed order on the day the order became force.</w:t>
+        <w:t>The archive could not follow two letters through another house's corridors to the hand that had written them. It could not put itself between three boys and a sealed order on the day the order became force.</w:t>
       </w:r>
     </w:p>
     <w:p>
@@ -181,7 +161,7 @@
           <w:i w:val="0"/>
           <w:strike w:val="0"/>
         </w:rPr>
-        <w:t>She thought of Ashoka. Set aside the force ladder and the uniforms, and what was left was the Ashoka its own instructors believed in: strength kept under discipline, a body placed between a person and an accusation before the accusation hardened into a sentence.</w:t>
+        <w:t>She thought of Ashoka. Set aside the force ladder and the uniforms, and what was left was the Ashoka its own instructors believed in: strength kept under discipline, a body placed between a person and an accusation.</w:t>
       </w:r>
     </w:p>
     <w:p>
@@ -731,7 +711,7 @@
           <w:i w:val="0"/>
           <w:strike w:val="0"/>
         </w:rPr>
-        <w:t>Kubera dressed to be envied and Ashoka to be obeyed. Drona dressed for the work, plain enough to disappear beside whatever it studied. She checked the closure at each wrist. On the left, under the cuff, the terminal still held the morning's line. She let the cuff cover it and pulled her hair back from her face.</w:t>
+        <w:t>She checked the closure at each wrist. On the left, under the cuff, the terminal still held the morning's line. She let the cuff cover it and pulled her hair back from her face.</w:t>
       </w:r>
     </w:p>
     <w:p>
@@ -771,7 +751,7 @@
           <w:i w:val="0"/>
           <w:strike w:val="0"/>
         </w:rPr>
-        <w:t>The train arrived without a sound and rode a hand's width above the rail on nothing at all, and the carriage was moving before she felt it move.</w:t>
+        <w:t>The train arrived without a sound, and the carriage was moving before she felt it move.</w:t>
       </w:r>
     </w:p>
     <w:p>
@@ -781,7 +761,7 @@
           <w:i w:val="0"/>
           <w:strike w:val="0"/>
         </w:rPr>
-        <w:t>She read the passengers by habit; the monitoring room had taught her to read everything. A Kubera allocation officer sat with a ledger pane on one knee, his muted-gold insignia centered to the millimeter, moving figures across the glass with small proprietary flicks. By the central rail stood an Ashoka responder, broad enough to make the carriage seem narrower, balanced against its motion without touching the rail at all. He carried no weapon. He was one.</w:t>
+        <w:t>She read the passengers by habit. By the central rail stood an Ashoka responder, balanced against the carriage's motion without touching the rail at all. He carried no weapon, and nobody sat within arm's reach of him.</w:t>
       </w:r>
     </w:p>
     <w:p>
@@ -821,16 +801,6 @@
           <w:i w:val="0"/>
           <w:strike w:val="0"/>
         </w:rPr>
-        <w:t>Trinity-3 changed before the signs did. Drona's buildings invited the eye to rest. Ashoka's rose in hard planes, with reinforced bridges and landing decks broad enough for armored transports.</w:t>
-      </w:r>
-    </w:p>
-    <w:p>
-      <w:r>
-        <w:rPr>
-          <w:b w:val="0"/>
-          <w:i w:val="0"/>
-          <w:strike w:val="0"/>
-        </w:rPr>
         <w:t>"Ashoka Headquarters," the carriage said. "Authorized personnel only."</w:t>
       </w:r>
     </w:p>
@@ -841,7 +811,7 @@
           <w:i w:val="0"/>
           <w:strike w:val="0"/>
         </w:rPr>
-        <w:t>The station narrowed to a single gate of red-marked steel, and when Elara laid her hand to the scanner it read her insignia, the Ancient One's authority, and her destination.</w:t>
+        <w:t>The station narrowed to a single gate of red-marked steel. It read her insignia, the Ancient One's authority, and her destination, and opened one body wide.</w:t>
       </w:r>
     </w:p>
     <w:p>
@@ -851,27 +821,7 @@
           <w:i w:val="0"/>
           <w:strike w:val="0"/>
         </w:rPr>
-        <w:t>"Monitor Elara Nathan. Drona. Review Room Two. Access approved."</w:t>
-      </w:r>
-    </w:p>
-    <w:p>
-      <w:r>
-        <w:rPr>
-          <w:b w:val="0"/>
-          <w:i w:val="0"/>
-          <w:strike w:val="0"/>
-        </w:rPr>
-        <w:t>The gate opened one body wide and sealed behind her. A thin red line lit along the floor's edge, tracing her route.</w:t>
-      </w:r>
-    </w:p>
-    <w:p>
-      <w:r>
-        <w:rPr>
-          <w:b w:val="0"/>
-          <w:i w:val="0"/>
-          <w:strike w:val="0"/>
-        </w:rPr>
-        <w:t>Ashoka Headquarters rose around a central training court where recruits drilled under silent instructors. At the far end of the court, a red insignia had been set into the floor so deep it looked less like decoration than a wound the building had chosen to keep visible.</w:t>
+        <w:t>Ashoka Headquarters rose around a central training court where recruits drilled under silent instructors. At the far end of the court, a red insignia was cut so deep into the floor that recruits stepped around it.</w:t>
       </w:r>
     </w:p>
     <w:p>
@@ -991,7 +941,7 @@
           <w:i w:val="0"/>
           <w:strike w:val="0"/>
         </w:rPr>
-        <w:t>"Before the boys walked out of the mine gates, I altered the record," she said. "I kept them together. No one authorized it. I decided that what they chose in that chamber was evidence, and I preserved it." Her voice held. Her hands, flat on the table, did not. "And this morning at first bell I left my station during a live intake. The terminal logged it. It's appended to my open review. I won't tell you why I stood up, in this room or any other. You should know that before you agree to anything. The person asking for Ashoka's help has already broken procedure twice."</w:t>
+        <w:t>"Before the boys walked out of the mine gates, I altered the record," she said. "I kept them together. No one authorized it. I decided that what they chose in that chamber was evidence, and I preserved it." Her voice held. Her hands, flat on the table, did not. "And this morning at first bell I left my station during a live intake. The terminal logged it. It's appended to my open review. I won't tell you why I stood up. You should know that before you agree to anything. The person asking for Ashoka's help has already broken procedure twice."</w:t>
       </w:r>
     </w:p>
     <w:p>
@@ -1171,7 +1121,7 @@
           <w:i w:val="0"/>
           <w:strike w:val="0"/>
         </w:rPr>
-        <w:t>"There was a held number on the inspection list," she said. "4055. A dead man's slot, flagged for two years and never read. This morning the flag closed while the pool was empty and one boy stood at the head of the line, and the slot went to him. His father's number." Her palms pressed the wood and would not stop shaking. "I stood up so that it would close then. No one ordered it. I did it alone."</w:t>
+        <w:t>"There was a held number on the inspection list," she said. "4055. A dead man's slot, flagged for two years and never read. This morning the flag closed while the pool was empty and one boy stood at the head of the line, and the slot went to him. His father's number." Her palms pressed the wood and would not stop shaking. "I stood up so that it would close then."</w:t>
       </w:r>
     </w:p>
     <w:p>

</xml_diff>

<commit_message>
Ch10: Drona runner, separation directive, Little Dragons gloss, She had come anyway
Co-Authored-By: Claude Opus 5.5 <noreply@anthropic.com>
</commit_message>
<xml_diff>
--- a/claude-notes/manuscript-v2/10-then-the-key-merged.docx
+++ b/claude-notes/manuscript-v2/10-then-the-key-merged.docx
@@ -141,7 +141,7 @@
           <w:i w:val="0"/>
           <w:strike w:val="0"/>
         </w:rPr>
-        <w:t>The archive could not follow two letters through another house's corridors to the hand that had written them. It could not put itself between three boys and a sealed order on the day the order became force.</w:t>
+        <w:t>The archive could not follow two letters through another house's corridors to the hand that had written them. It could not put itself between three boys and a separation directive on the day review stopped withholding it.</w:t>
       </w:r>
     </w:p>
     <w:p>
@@ -227,7 +227,7 @@
           <w:i w:val="0"/>
           <w:strike w:val="0"/>
         </w:rPr>
-        <w:t>She folded the longer note once. By the time the grille stopped ticking, it was on its way to a door in the Ashoka barracks.</w:t>
+        <w:t>She folded the longer note once. By the time the grille stopped ticking, a Drona runner was carrying it to a door in the Ashoka barracks.</w:t>
       </w:r>
     </w:p>
     <w:p>
@@ -257,7 +257,7 @@
           <w:i w:val="0"/>
           <w:strike w:val="0"/>
         </w:rPr>
-        <w:t>The one exception was wedged into the slot of the boot rack: a paper crane, lopsided, one wing folded twice and the head bent the wrong way. The smallest of the Little Dragons had refused to bow out of class until he accepted it. He had not found a regulation that covered it, so it stayed.</w:t>
+        <w:t>The one exception was wedged into the slot of the boot rack: a paper crane, lopsided, one wing folded twice and the head bent the wrong way. The smallest of the Little Dragons, the barracks' youngest class, had refused to bow out of class until he accepted it. He had not found a regulation that covered it, so it stayed.</w:t>
       </w:r>
     </w:p>
     <w:p>
@@ -1071,7 +1071,7 @@
           <w:i w:val="0"/>
           <w:strike w:val="0"/>
         </w:rPr>
-        <w:t>Anandi, Kavik, Sarvajña, Draṣṭā, the Ancient One: none of them had given her certainty. They had given her the discipline to act without it.</w:t>
+        <w:t>Anandi, Kavik, Sarvajña, Draṣṭā, the Ancient One: none of them had given her certainty. She had come anyway.</w:t>
       </w:r>
     </w:p>
     <w:p>

</xml_diff>